<commit_message>
Evidence: explorer links point at www.kravii.com (all 52 transactions checked on the live chain); installers and scripts use the new address
Co-Authored-By: Claude Opus 5.5 <noreply@anthropic.com>
</commit_message>
<xml_diff>
--- a/docs/Agentic-Wallet-Technical-Documentation.docx
+++ b/docs/Agentic-Wallet-Technical-Documentation.docx
@@ -51,7 +51,7 @@
           <w:color w:val="56635D"/>
           <w:sz w:val="19"/>
         </w:rPr>
-        <w:t>agentic-wallet-inky.vercel.app</w:t>
+        <w:t>www.kravii.com</w:t>
       </w:r>
     </w:p>
     <w:p>
@@ -5487,7 +5487,7 @@
           <w:color w:val="0D6B5B"/>
           <w:sz w:val="19"/>
         </w:rPr>
-        <w:t>cast receipt &lt;hash&gt; --rpc-url https://agentic-wallet-inky.vercel.app/api/rpc</w:t>
+        <w:t>cast receipt &lt;hash&gt; --rpc-url https://www.kravii.com/api/rpc</w:t>
       </w:r>
       <w:r>
         <w:rPr>

</xml_diff>